<commit_message>
Add Rust and Docker skills, update project descriptions, and style enhancements for Trading Simulator
</commit_message>
<xml_diff>
--- a/Philip_Ondieki_CV.docx
+++ b/Philip_Ondieki_CV.docx
@@ -117,7 +117,7 @@
           <w:color w:val="1A1A1A"/>
           <w:sz w:val="20"/>
         </w:rPr>
-        <w:t>Next.js, TypeScript, React.js, Node.js, Express.js, PostgreSQL, MongoDB, RESTful API Design, JWT Authentication, Tailwind CSS, Firebase/Firestore, Git &amp; GitHub, Socket.io, Python</w:t>
+        <w:t>Next.js, TypeScript, React.js, Node.js, Rust, Express.js, PostgreSQL, MongoDB, RESTful API Design, JWT Authentication, Tailwind CSS, Firebase/Firestore, Git &amp; GitHub, Docker, Socket.io, Python</w:t>
       </w:r>
     </w:p>
     <w:p>
@@ -180,7 +180,7 @@
           <w:color w:val="1A1A1A"/>
           <w:sz w:val="21"/>
         </w:rPr>
-        <w:t>Node.js, Express.js, RESTful API Design, Socket.io, JWT (JSON Web Tokens), API Authentication, CORS, Middleware Design</w:t>
+        <w:t>Node.js, Express.js, Rust, RESTful API Design, Socket.io, JWT (JSON Web Tokens), API Authentication, CORS, Middleware Design</w:t>
       </w:r>
     </w:p>
     <w:p>
@@ -224,7 +224,7 @@
           <w:color w:val="1A1A1A"/>
           <w:sz w:val="21"/>
         </w:rPr>
-        <w:t>Git &amp; GitHub, Firebase, Firestore, Cloudinary, Paystack (M-Pesa Integration), PayPal SDK, Stripe.js, Python, Flask</w:t>
+        <w:t>Git &amp; GitHub, Firebase, Firestore, Cloudinary, Paystack (M-Pesa Integration), PayPal SDK, Stripe.js, Protocol Buffers, Docker, Python, Flask</w:t>
       </w:r>
     </w:p>
     <w:p>
@@ -755,6 +755,72 @@
     <w:p>
       <w:pPr>
         <w:spacing w:before="200" w:after="40"/>
+      </w:pPr>
+      <w:r>
+        <w:rPr>
+          <w:rFonts w:ascii="Calibri" w:hAnsi="Calibri"/>
+          <w:b/>
+          <w:i w:val="0"/>
+          <w:color w:val="1A3C6E"/>
+          <w:sz w:val="21"/>
+        </w:rPr>
+        <w:t>Systems Project</w:t>
+      </w:r>
+    </w:p>
+    <w:p>
+      <w:pPr>
+        <w:spacing w:before="160" w:after="20"/>
+      </w:pPr>
+      <w:r>
+        <w:rPr>
+          <w:rFonts w:ascii="Calibri" w:hAnsi="Calibri"/>
+          <w:b/>
+          <w:color w:val="1A1A1A"/>
+          <w:sz w:val="22"/>
+        </w:rPr>
+        <w:t>Prop Firm Trading Simulator</w:t>
+      </w:r>
+      <w:r>
+        <w:rPr>
+          <w:rFonts w:ascii="Calibri" w:hAnsi="Calibri"/>
+          <w:i/>
+          <w:color w:val="1A1A1A"/>
+          <w:sz w:val="19"/>
+        </w:rPr>
+        <w:t xml:space="preserve"> | Rust, TypeScript, PostgreSQL, WebSocket, Protobuf, Docker | github.com/PhilipOndieki/tradingsimulator</w:t>
+      </w:r>
+    </w:p>
+    <w:p>
+      <w:pPr>
+        <w:pStyle w:val="ListBullet"/>
+        <w:spacing w:after="40"/>
+      </w:pPr>
+      <w:r>
+        <w:rPr>
+          <w:rFonts w:ascii="Calibri" w:hAnsi="Calibri"/>
+          <w:color w:val="1A1A1A"/>
+          <w:sz w:val="21"/>
+        </w:rPr>
+        <w:t>Full-stack trading simulator with an async Rust microservice backend (price-engine, ws-gateway, order-engine) streaming live tick data over WebSocket/Protobuf to a React charting frontend, modeled after real prop-firm platforms like FundingPips.</w:t>
+      </w:r>
+    </w:p>
+    <w:p>
+      <w:pPr>
+        <w:pStyle w:val="ListBullet"/>
+        <w:spacing w:after="40"/>
+      </w:pPr>
+      <w:r>
+        <w:rPr>
+          <w:rFonts w:ascii="Calibri" w:hAnsi="Calibri"/>
+          <w:color w:val="1A1A1A"/>
+          <w:sz w:val="21"/>
+        </w:rPr>
+        <w:t>Hybrid Geometric Brownian Motion and live-market price simulation with a pure, unit-tested P&amp;L/margin logic library and reliability-tested external API integration (rate limiting, graceful degradation).</w:t>
+      </w:r>
+    </w:p>
+    <w:p>
+      <w:pPr>
+        <w:spacing w:before="200" w:after="40"/>
         <w:jc w:val="left"/>
       </w:pPr>
       <w:r>

</xml_diff>